<commit_message>
docs: sua tieu de 5.9.2 — bang liet ke sau hang muc nhung mot da hoan thanh
Tieu de ghi 'Sau hang muc chua do' trong khi mot dong trong bang la benchmark
engine OCR, da chay 03/08 va danh dau hoan thanh. Doi thanh 'Sau hang muc tung
de ngo — nam chua do, mot da hoan thanh'.

Co-Authored-By: Claude Opus 5 <noreply@anthropic.com>
</commit_message>
<xml_diff>
--- a/docs/papers/thesis-full.docx
+++ b/docs/papers/thesis-full.docx
@@ -36753,13 +36753,13 @@
       </w:r>
     </w:p>
     <w:bookmarkEnd w:id="169"/>
-    <w:bookmarkStart w:id="170" w:name="X4e2434d65d21be08412925d0b90857663d6c792"/>
+    <w:bookmarkStart w:id="170" w:name="X4a5515ab729f0d564e9235bb02ef0e1eba8bfd3"/>
     <w:p>
       <w:pPr>
         <w:pStyle w:val="Heading3"/>
       </w:pPr>
       <w:r>
-        <w:t xml:space="preserve">5.9.2. Sáu hạng mục chưa đo và trạng thái khắc phục</w:t>
+        <w:t xml:space="preserve">5.9.2. Sáu hạng mục từng để ngỏ — năm chưa đo, một đã hoàn thành</w:t>
       </w:r>
     </w:p>
     <w:tbl>

</xml_diff>

<commit_message>
fix(backend): job that fails now leaves a row instead of nothing
_create_job flushed and left the transaction open, on the reasoning
that a later failure should roll the whole detection back rather than
leave a job with no results. That produced the opposite: _fail_job
calls rollback() before writing the failure record, so the uncommitted
job row went with it and a failed image upload left zero rows -- the
one case where the record matters most.

_create_job now commits, matching create_video_job, which already did.
The redundant commit inside create_video_job is gone.

The integration test carried xfail(strict=True) with the defect written
into its docstring; the marker is removed and the docstring now records
the history. 1002 passed, 0 xfail (was 1001 + 1 xfail). Test counts
updated in ch1, ch6, ch9, both defence decks and the poster.

Co-Authored-By: Claude Opus 5 <noreply@anthropic.com>
</commit_message>
<xml_diff>
--- a/docs/papers/thesis-full.docx
+++ b/docs/papers/thesis-full.docx
@@ -4839,36 +4839,7 @@
           <w:b/>
           <w:bCs/>
         </w:rPr>
-        <w:t xml:space="preserve">1.002 test thu thập / 1.001 đạt / 1</w:t>
-      </w:r>
-      <w:r>
-        <w:rPr>
-          <w:b/>
-          <w:bCs/>
-        </w:rPr>
-        <w:t xml:space="preserve"> </w:t>
-      </w:r>
-      <w:r>
-        <w:rPr>
-          <w:rStyle w:val="VerbatimChar"/>
-          <w:b/>
-          <w:bCs/>
-        </w:rPr>
-        <w:t xml:space="preserve">xfail</w:t>
-      </w:r>
-      <w:r>
-        <w:rPr>
-          <w:b/>
-          <w:bCs/>
-        </w:rPr>
-        <w:t xml:space="preserve"> </w:t>
-      </w:r>
-      <w:r>
-        <w:rPr>
-          <w:b/>
-          <w:bCs/>
-        </w:rPr>
-        <w:t xml:space="preserve">/ 0 thất bại</w:t>
+        <w:t xml:space="preserve">1.002 test thu thập / 1.002 đạt / 0 thất bại</w:t>
       </w:r>
       <w:r>
         <w:t xml:space="preserve">. Khảo sát cho thấy mã nguồn mở ALPR Việt Nam chủ yếu là script rời rạc</w:t>
@@ -38782,7 +38753,7 @@
           <w:b/>
           <w:bCs/>
         </w:rPr>
-        <w:t xml:space="preserve">1.001/1.002</w:t>
+        <w:t xml:space="preserve">1.002/1.002</w:t>
       </w:r>
       <w:r>
         <w:t xml:space="preserve"> </w:t>
@@ -45822,7 +45793,7 @@
                 <w:b/>
                 <w:bCs/>
               </w:rPr>
-              <w:t xml:space="preserve">1.001</w:t>
+              <w:t xml:space="preserve">1.002</w:t>
             </w:r>
           </w:p>
         </w:tc>
@@ -45848,18 +45819,18 @@
                 <w:i/>
                 <w:iCs/>
               </w:rPr>
-              <w:t xml:space="preserve">(dự kiến hỏng, có ghi lý do)</w:t>
-            </w:r>
-          </w:p>
-        </w:tc>
-        <w:tc>
-          <w:tcPr/>
-          <w:p>
-            <w:pPr>
-              <w:pStyle w:val="Compact"/>
-            </w:pPr>
-            <w:r>
-              <w:t xml:space="preserve">1</w:t>
+              <w:t xml:space="preserve">(dự kiến hỏng)</w:t>
+            </w:r>
+          </w:p>
+        </w:tc>
+        <w:tc>
+          <w:tcPr/>
+          <w:p>
+            <w:pPr>
+              <w:pStyle w:val="Compact"/>
+            </w:pPr>
+            <w:r>
+              <w:t xml:space="preserve">0</w:t>
             </w:r>
           </w:p>
         </w:tc>

</xml_diff>